<commit_message>
Add asssigned working paper number
</commit_message>
<xml_diff>
--- a/2025-MLS-projections/2025 MLS projections for CMM 24-06.docx
+++ b/2025-MLS-projections/2025 MLS projections for CMM 24-06.docx
@@ -12749,6 +12749,7 @@
           <w:docPartUnique/>
         </w:docPartObj>
       </w:sdtPr>
+      <w:sdtEndPr/>
       <w:sdtContent>
         <w:r>
           <w:rPr>
@@ -12783,7 +12784,7 @@
               </v:handles>
               <o:lock v:ext="edit" text="t" shapetype="t"/>
             </v:shapetype>
-            <v:shape id="PowerPlusWaterMarkObject357831064" o:spid="_x0000_s2049" type="#_x0000_t136" style="position:absolute;left:0;text-align:left;margin-left:0;margin-top:0;width:412.4pt;height:247.45pt;rotation:315;z-index:-251657216;mso-position-horizontal:center;mso-position-horizontal-relative:margin;mso-position-vertical:center;mso-position-vertical-relative:margin" o:allowincell="f" fillcolor="silver" stroked="f">
+            <v:shape id="PowerPlusWaterMarkObject357831064" o:spid="_x0000_s2049" type="#_x0000_t136" style="position:absolute;left:0;text-align:left;margin-left:0;margin-top:0;width:412.4pt;height:247.45pt;rotation:315;z-index:-251658752;mso-position-horizontal:center;mso-position-horizontal-relative:margin;mso-position-vertical:center;mso-position-vertical-relative:margin" o:allowincell="f" fillcolor="silver" stroked="f">
               <v:fill opacity=".5"/>
               <v:textpath style="font-family:&quot;Calibri&quot;;font-size:1pt" string="DRAFT"/>
               <w10:wrap anchorx="margin" anchory="margin"/>
@@ -12799,7 +12800,16 @@
         <w:color w:val="000000"/>
         <w:szCs w:val="24"/>
       </w:rPr>
-      <w:t>ISC/25/BILLWG-02/XX</w:t>
+      <w:t>ISC/25/BILLWG-02/</w:t>
+    </w:r>
+    <w:r>
+      <w:rPr>
+        <w:rFonts w:ascii="Cambria" w:eastAsia="Cambria" w:hAnsi="Cambria" w:cs="Cambria"/>
+        <w:b/>
+        <w:color w:val="000000"/>
+        <w:szCs w:val="24"/>
+      </w:rPr>
+      <w:t>01</w:t>
     </w:r>
     <w:r>
       <w:rPr>

</xml_diff>

<commit_message>
Update working paper to incorporate review comments
</commit_message>
<xml_diff>
--- a/2025-MLS-projections/2025 MLS projections for CMM 24-06.docx
+++ b/2025-MLS-projections/2025 MLS projections for CMM 24-06.docx
@@ -2827,7 +2827,31 @@
         <w:t xml:space="preserve">. </w:t>
       </w:r>
       <w:r>
-        <w:t>For the CMM 2024-06 projections, observed annual catches during 2021-2023 and imputed catches for 2024 were based on the 2024 WCPFC Yearbook data, except for Japan and the U.S., which updated catches in 2025. The annual catches in 2021-2024 used for the CMM 2024-06 projections were 1540, 1470, 1685, and 2157 mt, respectively. For the 2024 rebuilding projections, t</w:t>
+        <w:t>For the CMM 2024-06 projections, observed annual catches during 2021-2023 and imputed catches for 2024 were based on the 2024 WCPFC Yearbook data, except for Japan and the U.S., which updated catches in 2025. The annual catches used for the CMM 2024-06 projections were 1540</w:t>
+      </w:r>
+      <w:r>
+        <w:t xml:space="preserve"> (2021)</w:t>
+      </w:r>
+      <w:r>
+        <w:t>, 1470</w:t>
+      </w:r>
+      <w:r>
+        <w:t xml:space="preserve"> (2022)</w:t>
+      </w:r>
+      <w:r>
+        <w:t>, 1685</w:t>
+      </w:r>
+      <w:r>
+        <w:t xml:space="preserve"> (2023)</w:t>
+      </w:r>
+      <w:r>
+        <w:t>, and 2157 mt</w:t>
+      </w:r>
+      <w:r>
+        <w:t xml:space="preserve"> (2024)</w:t>
+      </w:r>
+      <w:r>
+        <w:t>. For the 2024 rebuilding projections, t</w:t>
       </w:r>
       <w:r>
         <w:t xml:space="preserve">he recent average fishing mortality during 2018-2020 was used to set the initial catches during 2021-2024. Under this assumption of status quo fishing mortality, the projected median catches during 2021-2024 were 2910, 3380, 3320, and 3030 mt, respectively (Brodziak 2024, Table 10.9, </w:t>
@@ -4035,25 +4059,19 @@
         <w:t>4</w:t>
       </w:r>
       <w:r>
-        <w:t xml:space="preserve">%. Scenario 3, with carryover in both 2025 and 2026, had the highest overfishing probability of </w:t>
-      </w:r>
-      <w:r>
-        <w:t>40</w:t>
-      </w:r>
-      <w:r>
-        <w:t>% in 202</w:t>
-      </w:r>
-      <w:r>
-        <w:t>6</w:t>
-      </w:r>
-      <w:r>
-        <w:t xml:space="preserve">—a </w:t>
-      </w:r>
-      <w:r>
-        <w:t>five</w:t>
-      </w:r>
-      <w:r>
-        <w:t>fold increase over Scenario 1. This pattern highlights a trade-off between short-term catch gains and conservation risks.</w:t>
+        <w:t xml:space="preserve">%. Scenario 3, </w:t>
+      </w:r>
+      <w:r>
+        <w:t>which includes carryover in both 2025 and 2026, resulted in the highest overfishing probability</w:t>
+      </w:r>
+      <w:r>
+        <w:t xml:space="preserve">, </w:t>
+      </w:r>
+      <w:r>
+        <w:t>40% in 2026, a fivefold increase over Scenario 1.</w:t>
+      </w:r>
+      <w:r>
+        <w:t>. This pattern highlights a trade-off between short-term catch gains and conservation risks.</w:t>
       </w:r>
       <w:r>
         <w:t xml:space="preserve"> Overall, the scenarios illustrate that short-term catch increases from carryover provisions would temporarily boost yield but would also require stricter long-term harvest reductions and incur higher risks of exceeding biological limits in the interim.</w:t>
@@ -12733,73 +12751,6 @@
         <w:color w:val="000000"/>
         <w:szCs w:val="24"/>
       </w:rPr>
-      <w:t xml:space="preserve">Draft </w:t>
-    </w:r>
-    <w:sdt>
-      <w:sdtPr>
-        <w:rPr>
-          <w:rFonts w:ascii="Cambria" w:eastAsia="Cambria" w:hAnsi="Cambria" w:cs="Cambria"/>
-          <w:b/>
-          <w:color w:val="000000"/>
-          <w:szCs w:val="24"/>
-        </w:rPr>
-        <w:id w:val="-530952139"/>
-        <w:docPartObj>
-          <w:docPartGallery w:val="Watermarks"/>
-          <w:docPartUnique/>
-        </w:docPartObj>
-      </w:sdtPr>
-      <w:sdtEndPr/>
-      <w:sdtContent>
-        <w:r>
-          <w:rPr>
-            <w:rFonts w:ascii="Cambria" w:eastAsia="Cambria" w:hAnsi="Cambria" w:cs="Cambria"/>
-            <w:b/>
-            <w:noProof/>
-            <w:color w:val="000000"/>
-            <w:szCs w:val="24"/>
-          </w:rPr>
-          <w:pict w14:anchorId="30DB1489">
-            <v:shapetype id="_x0000_t136" coordsize="21600,21600" o:spt="136" adj="10800" path="m@7,l@8,m@5,21600l@6,21600e">
-              <v:formulas>
-                <v:f eqn="sum #0 0 10800"/>
-                <v:f eqn="prod #0 2 1"/>
-                <v:f eqn="sum 21600 0 @1"/>
-                <v:f eqn="sum 0 0 @2"/>
-                <v:f eqn="sum 21600 0 @3"/>
-                <v:f eqn="if @0 @3 0"/>
-                <v:f eqn="if @0 21600 @1"/>
-                <v:f eqn="if @0 0 @2"/>
-                <v:f eqn="if @0 @4 21600"/>
-                <v:f eqn="mid @5 @6"/>
-                <v:f eqn="mid @8 @5"/>
-                <v:f eqn="mid @7 @8"/>
-                <v:f eqn="mid @6 @7"/>
-                <v:f eqn="sum @6 0 @5"/>
-              </v:formulas>
-              <v:path textpathok="t" o:connecttype="custom" o:connectlocs="@9,0;@10,10800;@11,21600;@12,10800" o:connectangles="270,180,90,0"/>
-              <v:textpath on="t" fitshape="t"/>
-              <v:handles>
-                <v:h position="#0,bottomRight" xrange="6629,14971"/>
-              </v:handles>
-              <o:lock v:ext="edit" text="t" shapetype="t"/>
-            </v:shapetype>
-            <v:shape id="PowerPlusWaterMarkObject357831064" o:spid="_x0000_s2049" type="#_x0000_t136" style="position:absolute;left:0;text-align:left;margin-left:0;margin-top:0;width:412.4pt;height:247.45pt;rotation:315;z-index:-251658752;mso-position-horizontal:center;mso-position-horizontal-relative:margin;mso-position-vertical:center;mso-position-vertical-relative:margin" o:allowincell="f" fillcolor="silver" stroked="f">
-              <v:fill opacity=".5"/>
-              <v:textpath style="font-family:&quot;Calibri&quot;;font-size:1pt" string="DRAFT"/>
-              <w10:wrap anchorx="margin" anchory="margin"/>
-            </v:shape>
-          </w:pict>
-        </w:r>
-      </w:sdtContent>
-    </w:sdt>
-    <w:r>
-      <w:rPr>
-        <w:rFonts w:ascii="Cambria" w:eastAsia="Cambria" w:hAnsi="Cambria" w:cs="Cambria"/>
-        <w:b/>
-        <w:color w:val="000000"/>
-        <w:szCs w:val="24"/>
-      </w:rPr>
       <w:t>ISC/25/BILLWG-02/</w:t>
     </w:r>
     <w:r>
@@ -12810,15 +12761,6 @@
         <w:szCs w:val="24"/>
       </w:rPr>
       <w:t>01</w:t>
-    </w:r>
-    <w:r>
-      <w:rPr>
-        <w:rFonts w:ascii="Cambria" w:eastAsia="Cambria" w:hAnsi="Cambria" w:cs="Cambria"/>
-        <w:b/>
-        <w:color w:val="000000"/>
-        <w:szCs w:val="24"/>
-      </w:rPr>
-      <w:t xml:space="preserve"> – Do not cite.</w:t>
     </w:r>
   </w:p>
 </w:hdr>

</xml_diff>